<commit_message>
docs(diagram): design high-res system architecture diagram and embed into report docx
</commit_message>
<xml_diff>
--- a/report/Bao_Cao_Job_Board_DTC245200251.docx
+++ b/report/Bao_Cao_Job_Board_DTC245200251.docx
@@ -417,65 +417,49 @@
         <w:t>Promtail tự động đọc log từ các container và đẩy về Loki server, cho phép kỹ trị tra cứu log bằng ngôn ngữ LogQL.</w:t>
       </w:r>
     </w:p>
-    <w:tbl>
-      <w:tblPr>
-        <w:tblW w:type="auto" w:w="0"/>
-        <w:jc w:val="center"/>
-        <w:tblLayout w:type="fixed"/>
-        <w:tblLook w:firstColumn="1" w:firstRow="1" w:lastColumn="0" w:lastRow="0" w:noHBand="0" w:noVBand="1" w:val="04A0"/>
-      </w:tblPr>
-      <w:tblGrid>
-        <w:gridCol w:w="8928"/>
-      </w:tblGrid>
-      <w:tr>
-        <w:tc>
-          <w:tcPr>
-            <w:tcW w:type="dxa" w:w="9072"/>
-            <w:shd w:fill="F1F5F9"/>
-            <w:tcMar>
-              <w:top w:w="160" w:type="dxa"/>
-              <w:bottom w:w="160" w:type="dxa"/>
-              <w:left w:w="160" w:type="dxa"/>
-              <w:right w:w="160" w:type="dxa"/>
-            </w:tcMar>
-            <w:tcBorders>
-              <w:left w:val="dashed" w:sz="8" w:space="0" w:color="64748B"/>
-              <w:top w:val="dashed" w:sz="8" w:space="0" w:color="64748B"/>
-              <w:right w:val="dashed" w:sz="8" w:space="0" w:color="64748B"/>
-              <w:bottom w:val="dashed" w:sz="8" w:space="0" w:color="64748B"/>
-            </w:tcBorders>
-          </w:tcPr>
-          <w:p>
-            <w:pPr>
-              <w:spacing w:before="280" w:after="280"/>
-              <w:jc w:val="center"/>
-            </w:pPr>
-            <w:r>
-              <w:rPr>
-                <w:rFonts w:ascii="Times New Roman" w:hAnsi="Times New Roman"/>
-                <w:b/>
-                <w:color w:val="334155"/>
-                <w:sz w:val="22"/>
-              </w:rPr>
-              <w:t>[ HÌNH ẢNH MINH CHỨNG THỰC TẾ HỆ THỐNG ]</w:t>
-              <w:br/>
-            </w:r>
-            <w:r>
-              <w:rPr>
-                <w:rFonts w:ascii="Times New Roman" w:hAnsi="Times New Roman"/>
-                <w:i/>
-                <w:color w:val="64748B"/>
-                <w:sz w:val="21"/>
-              </w:rPr>
-              <w:t>Ảnh chụp màn hình: Sơ đồ kiến trúc tổng thể hệ thống Job Board DevOps với 3 dải mạng phân tách độc lập</w:t>
-            </w:r>
-          </w:p>
-        </w:tc>
-      </w:tr>
-    </w:tbl>
     <w:p>
       <w:pPr>
-        <w:spacing w:before="60" w:after="160"/>
+        <w:spacing w:before="160" w:after="40"/>
+        <w:jc w:val="center"/>
+      </w:pPr>
+      <w:r>
+        <w:drawing>
+          <wp:inline xmlns:a="http://schemas.openxmlformats.org/drawingml/2006/main" xmlns:pic="http://schemas.openxmlformats.org/drawingml/2006/picture">
+            <wp:extent cx="5669280" cy="3897630"/>
+            <wp:docPr id="1" name="Picture 1"/>
+            <wp:cNvGraphicFramePr>
+              <a:graphicFrameLocks noChangeAspect="1"/>
+            </wp:cNvGraphicFramePr>
+            <a:graphic>
+              <a:graphicData uri="http://schemas.openxmlformats.org/drawingml/2006/picture">
+                <pic:pic>
+                  <pic:nvPicPr>
+                    <pic:cNvPr id="0" name="system_architecture.png"/>
+                    <pic:cNvPicPr/>
+                  </pic:nvPicPr>
+                  <pic:blipFill>
+                    <a:blip r:embed="rId11"/>
+                    <a:stretch>
+                      <a:fillRect/>
+                    </a:stretch>
+                  </pic:blipFill>
+                  <pic:spPr>
+                    <a:xfrm>
+                      <a:off x="0" y="0"/>
+                      <a:ext cx="5669280" cy="3897630"/>
+                    </a:xfrm>
+                    <a:prstGeom prst="rect"/>
+                  </pic:spPr>
+                </pic:pic>
+              </a:graphicData>
+            </a:graphic>
+          </wp:inline>
+        </w:drawing>
+      </w:r>
+    </w:p>
+    <w:p>
+      <w:pPr>
+        <w:spacing w:before="40" w:after="160"/>
         <w:jc w:val="center"/>
       </w:pPr>
       <w:r>
@@ -486,7 +470,7 @@
           <w:color w:val="1E293B"/>
           <w:sz w:val="21"/>
         </w:rPr>
-        <w:t>Hình: Sơ đồ kiến trúc tổng thể hệ thống Job Board DevOps với 3 dải mạng phân tách độc lập</w:t>
+        <w:t>Hình 1.1: Sơ đồ kiến trúc tổng thể hệ thống Job Board DevOps với 3 dải mạng phân tách</w:t>
       </w:r>
     </w:p>
     <w:p>

</xml_diff>

<commit_message>
docs(diagram): update UML architecture diagram exactly matching sample image
</commit_message>
<xml_diff>
--- a/report/Bao_Cao_Job_Board_DTC245200251.docx
+++ b/report/Bao_Cao_Job_Board_DTC245200251.docx
@@ -425,7 +425,7 @@
       <w:r>
         <w:drawing>
           <wp:inline xmlns:a="http://schemas.openxmlformats.org/drawingml/2006/main" xmlns:pic="http://schemas.openxmlformats.org/drawingml/2006/picture">
-            <wp:extent cx="5669280" cy="3897630"/>
+            <wp:extent cx="5669280" cy="4896196"/>
             <wp:docPr id="1" name="Picture 1"/>
             <wp:cNvGraphicFramePr>
               <a:graphicFrameLocks noChangeAspect="1"/>
@@ -446,7 +446,7 @@
                   <pic:spPr>
                     <a:xfrm>
                       <a:off x="0" y="0"/>
-                      <a:ext cx="5669280" cy="3897630"/>
+                      <a:ext cx="5669280" cy="4896196"/>
                     </a:xfrm>
                     <a:prstGeom prst="rect"/>
                   </pic:spPr>

</xml_diff>